<commit_message>
feat(bieu-mau): Mẫu 09B như phiếu đã nộp; nhận xét theo nhóm tiêu chí chung; nội dung tiêu chí con nguyên văn
- Nhận xét theo nhóm tiêu chí chung (GeneralGroupNotes, jsonb theo mã nhóm, migration AddGeneralGroupNotes): nhập ở dòng nhóm
  của phiếu tự chấm, in ở ô "Tóm tắt kết quả/Tài liệu minh chứng" của dòng nhóm Mẫu 09A/09B (G_NOTE), hiện trên trang hồ sơ.
- Tiêu chí con có "nội dung in trên phiếu" (formText); bộ mặc định = nguyên văn biểu mẫu gốc; sửa được ở trang Bộ tiêu chí.
- Mẫu 09B: bỏ ghi chú soạn thảo tô vàng; "Quý III"; ngày sinh; chức vụ 3 dòng; đơn vị kèm tên công ty; điểm tổng in gọn
  ("30"); nới cột "Điểm tối đa". Template sửa bằng tools/templates/fix_mau09b_layout.py.
</commit_message>
<xml_diff>
--- a/backend/src/CongTacDang.Infrastructure/Templates/Word/Mau_09A_PhieuTuCham.docx
+++ b/backend/src/CongTacDang.Infrastructure/Templates/Word/Mau_09A_PhieuTuCham.docx
@@ -1003,6 +1003,23 @@
                     <w:lang w:val="en-US"/>
                   </w:rPr>
                 </w:pPr>
+                <w:sdt>
+                  <w:sdtPr>
+                    <w:alias w:val="G_NOTE"/>
+                    <w:tag w:val="G_NOTE"/>
+                    <w:id w:val="921036"/>
+                  </w:sdtPr>
+                  <w:sdtContent>
+                    <w:r>
+                      <w:rPr>
+                        <w:b/>
+                        <w:sz w:val="24"/>
+                        <w:lang w:val="en-US"/>
+                      </w:rPr>
+                      <w:t xml:space="preserve"> </w:t>
+                    </w:r>
+                  </w:sdtContent>
+                </w:sdt>
               </w:p>
             </w:tc>
           </w:tr>

</xml_diff>

<commit_message>
feat(bieu-mau): lưu nội dung trước của đề nghị điều chỉnh, đặt tên tệp xuất theo HD03, ngày sinh trên Mẫu 09A
</commit_message>
<xml_diff>
--- a/backend/src/CongTacDang.Infrastructure/Templates/Word/Mau_09A_PhieuTuCham.docx
+++ b/backend/src/CongTacDang.Infrastructure/Templates/Word/Mau_09A_PhieuTuCham.docx
@@ -436,8 +436,23 @@
         <w:rPr>
           <w:sz w:val="24"/>
         </w:rPr>
-        <w:t xml:space="preserve">  Ngày sinh: ……/……/…………</w:t>
+        <w:t xml:space="preserve">  Ngày sinh: </w:t>
       </w:r>
+      <w:sdt>
+        <w:sdtPr>
+          <w:alias w:val="DATE_OF_BIRTH"/>
+          <w:tag w:val="DATE_OF_BIRTH"/>
+          <w:id w:val="921099"/>
+        </w:sdtPr>
+        <w:sdtContent>
+          <w:r>
+            <w:rPr>
+              <w:sz w:val="24"/>
+            </w:rPr>
+            <w:t xml:space="preserve">……/……/…………</w:t>
+          </w:r>
+        </w:sdtContent>
+      </w:sdt>
     </w:p>
     <w:p>
       <w:pPr>

</xml_diff>